<commit_message>
Make workshop announcement more promotional
Co-authored-by: snased <snased@users.noreply.github.com>
</commit_message>
<xml_diff>
--- a/супервизия/анонс_воркшопа_семифокусная_модель.docx
+++ b/супервизия/анонс_воркшопа_семифокусная_модель.docx
@@ -29,7 +29,7 @@
           <w:color w:val="C69538"/>
           <w:sz w:val="28"/>
         </w:rPr>
-        <w:t>для практикующих психологов и психотерапевтов</w:t>
+        <w:t>3 часа практики для психологов и психотерапевтов</w:t>
       </w:r>
     </w:p>
     <w:p>
@@ -43,7 +43,7 @@
           <w:color w:val="232F3E"/>
           <w:sz w:val="23"/>
         </w:rPr>
-        <w:t>Приглашаем практикующих психологов и психотерапевтов на 3-часовой воркшоп, посвященный семифокусной модели супервизии — профессиональному инструменту анализа терапевтической работы, который помогает глубже видеть клиента, терапевта, процесс, супервизионные отношения и духовно-нравственное измерение помощи.</w:t>
+        <w:t>Когда случай «не движется», терапевт устает, клиент вызывает сильные чувства, а в работе появляются вопросы границ, смысла и ответственности, важно иметь ясную карту, которая помогает не потеряться в процессе. Семифокусная модель супервизии дает такую карту.</w:t>
       </w:r>
     </w:p>
     <w:p>
@@ -57,7 +57,63 @@
           <w:color w:val="232F3E"/>
           <w:sz w:val="23"/>
         </w:rPr>
-        <w:t>Семифокусная модель опирается на классическую шестифокусную модель супервизии и дополняет ее седьмым фокусом — вниманием к отношениям с Богом, вопросам смысла, свободы, ответственности, смирения, профессиональных границ и духовной трезвости специалиста.</w:t>
+        <w:t>Приглашаем на 3-часовой воркшоп для практикующих психологов и психотерапевтов, где мы разберем, как смотреть на клиентский случай объемно: видеть клиента, терапевта, их отношения, супервизионный процесс, состояние специалиста и духовно-нравственное измерение помощи.</w:t>
+      </w:r>
+    </w:p>
+    <w:p>
+      <w:pPr>
+        <w:spacing w:before="200" w:after="120"/>
+      </w:pPr>
+      <w:r>
+        <w:rPr>
+          <w:rFonts w:ascii="DejaVu Sans" w:hAnsi="DejaVu Sans"/>
+          <w:b/>
+          <w:color w:val="27598B"/>
+          <w:sz w:val="32"/>
+        </w:rPr>
+        <w:t>Что такое семифокусная модель</w:t>
+      </w:r>
+    </w:p>
+    <w:p>
+      <w:pPr>
+        <w:spacing w:after="160"/>
+      </w:pPr>
+      <w:r>
+        <w:rPr>
+          <w:rFonts w:ascii="DejaVu Sans" w:hAnsi="DejaVu Sans"/>
+          <w:b w:val="0"/>
+          <w:color w:val="232F3E"/>
+          <w:sz w:val="22"/>
+        </w:rPr>
+        <w:t>Семифокусная модель супервизии — это расширенная карта профессионального внимания. Она опирается на классическую шестифокусную модель, где анализируется не только клиент, но и терапевт, их контакт, реакции супервизируемого, отношения с супервизором и состояние самого супервизора.</w:t>
+      </w:r>
+    </w:p>
+    <w:p>
+      <w:pPr>
+        <w:spacing w:after="160"/>
+      </w:pPr>
+      <w:r>
+        <w:rPr>
+          <w:rFonts w:ascii="DejaVu Sans" w:hAnsi="DejaVu Sans"/>
+          <w:b w:val="0"/>
+          <w:color w:val="232F3E"/>
+          <w:sz w:val="22"/>
+        </w:rPr>
+        <w:t>Седьмой фокус добавляет то, что особенно важно для христиански ориентированной практики: отношения с Богом, свободу клиента, смирение специалиста, различение духовного и психологического, а также внимательное удержание профессиональных границ без ухода в «спасательство».</w:t>
+      </w:r>
+    </w:p>
+    <w:p>
+      <w:pPr>
+        <w:spacing w:after="160"/>
+      </w:pPr>
+      <w:r>
+        <w:rPr>
+          <w:rFonts w:ascii="DejaVu Sans" w:hAnsi="DejaVu Sans"/>
+          <w:b/>
+          <w:color w:val="C69538"/>
+          <w:sz w:val="22"/>
+        </w:rPr>
+        <w:t>Эта модель помогает разбирать сложные случаи глубже и спокойнее: не сводить проблему только к технике, не объяснять все духовными причинами и не оставаться один на один с тяжелыми переживаниями в работе.</w:t>
       </w:r>
     </w:p>
     <w:p>
@@ -146,7 +202,22 @@
           <w:color w:val="232F3E"/>
           <w:sz w:val="22"/>
         </w:rPr>
-        <w:t>специалистам, сталкивающимся с выгоранием, контрпереносом, сложными случаями и вопросами границ.</w:t>
+        <w:t>специалистам, которые сталкиваются с выгоранием, контрпереносом, сложными случаями и вопросами границ;</w:t>
+      </w:r>
+    </w:p>
+    <w:p>
+      <w:pPr>
+        <w:pStyle w:val="ListBullet"/>
+        <w:spacing w:after="80"/>
+      </w:pPr>
+      <w:r>
+        <w:rPr>
+          <w:rFonts w:ascii="DejaVu Sans" w:hAnsi="DejaVu Sans"/>
+          <w:b w:val="0"/>
+          <w:color w:val="232F3E"/>
+          <w:sz w:val="22"/>
+        </w:rPr>
+        <w:t>тем, кто хочет сделать супервизию более структурной, живой и практически применимой.</w:t>
       </w:r>
     </w:p>
     <w:p>
@@ -160,7 +231,7 @@
           <w:color w:val="27598B"/>
           <w:sz w:val="32"/>
         </w:rPr>
-        <w:t>Что будем разбирать</w:t>
+        <w:t>Что будем разбирать на воркшопе</w:t>
       </w:r>
     </w:p>
     <w:p>
@@ -174,7 +245,7 @@
           <w:color w:val="232F3E"/>
           <w:sz w:val="22"/>
         </w:rPr>
-        <w:t>За 3 часа участники познакомятся с семью фокусами супервизионного внимания:</w:t>
+        <w:t>За 3 часа участники освоят семь фокусов супервизионного внимания:</w:t>
       </w:r>
     </w:p>
     <w:p>
@@ -293,6 +364,95 @@
           <w:color w:val="27598B"/>
           <w:sz w:val="32"/>
         </w:rPr>
+        <w:t>Почему стоит прийти</w:t>
+      </w:r>
+    </w:p>
+    <w:p>
+      <w:pPr>
+        <w:pStyle w:val="ListBullet"/>
+        <w:spacing w:after="80"/>
+      </w:pPr>
+      <w:r>
+        <w:rPr>
+          <w:rFonts w:ascii="DejaVu Sans" w:hAnsi="DejaVu Sans"/>
+          <w:b w:val="0"/>
+          <w:color w:val="232F3E"/>
+          <w:sz w:val="22"/>
+        </w:rPr>
+        <w:t>вы получите понятную схему, по которой можно разбирать реальные случаи уже после встречи;</w:t>
+      </w:r>
+    </w:p>
+    <w:p>
+      <w:pPr>
+        <w:pStyle w:val="ListBullet"/>
+        <w:spacing w:after="80"/>
+      </w:pPr>
+      <w:r>
+        <w:rPr>
+          <w:rFonts w:ascii="DejaVu Sans" w:hAnsi="DejaVu Sans"/>
+          <w:b w:val="0"/>
+          <w:color w:val="232F3E"/>
+          <w:sz w:val="22"/>
+        </w:rPr>
+        <w:t>увидите, где в работе теряется контакт, границы или профессиональная позиция;</w:t>
+      </w:r>
+    </w:p>
+    <w:p>
+      <w:pPr>
+        <w:pStyle w:val="ListBullet"/>
+        <w:spacing w:after="80"/>
+      </w:pPr>
+      <w:r>
+        <w:rPr>
+          <w:rFonts w:ascii="DejaVu Sans" w:hAnsi="DejaVu Sans"/>
+          <w:b w:val="0"/>
+          <w:color w:val="232F3E"/>
+          <w:sz w:val="22"/>
+        </w:rPr>
+        <w:t>научитесь замечать, что принадлежит клиенту, что терапевту, а что проявляется между ними;</w:t>
+      </w:r>
+    </w:p>
+    <w:p>
+      <w:pPr>
+        <w:pStyle w:val="ListBullet"/>
+        <w:spacing w:after="80"/>
+      </w:pPr>
+      <w:r>
+        <w:rPr>
+          <w:rFonts w:ascii="DejaVu Sans" w:hAnsi="DejaVu Sans"/>
+          <w:b w:val="0"/>
+          <w:color w:val="232F3E"/>
+          <w:sz w:val="22"/>
+        </w:rPr>
+        <w:t>сможете бережнее относиться к себе как к специалисту и снижать риск выгорания;</w:t>
+      </w:r>
+    </w:p>
+    <w:p>
+      <w:pPr>
+        <w:pStyle w:val="ListBullet"/>
+        <w:spacing w:after="80"/>
+      </w:pPr>
+      <w:r>
+        <w:rPr>
+          <w:rFonts w:ascii="DejaVu Sans" w:hAnsi="DejaVu Sans"/>
+          <w:b w:val="0"/>
+          <w:color w:val="232F3E"/>
+          <w:sz w:val="22"/>
+        </w:rPr>
+        <w:t>получите язык для обсуждения духовных вопросов без давления на клиента и без подмены психотерапии духовными объяснениями.</w:t>
+      </w:r>
+    </w:p>
+    <w:p>
+      <w:pPr>
+        <w:spacing w:before="200" w:after="120"/>
+      </w:pPr>
+      <w:r>
+        <w:rPr>
+          <w:rFonts w:ascii="DejaVu Sans" w:hAnsi="DejaVu Sans"/>
+          <w:b/>
+          <w:color w:val="27598B"/>
+          <w:sz w:val="32"/>
+        </w:rPr>
         <w:t>Формат</w:t>
       </w:r>
     </w:p>
@@ -307,7 +467,7 @@
           <w:color w:val="232F3E"/>
           <w:sz w:val="22"/>
         </w:rPr>
-        <w:t>Воркшоп сочетает мини-лекцию, разбор модели, практические вопросы для самодиагностики и работу с примерами из практики.</w:t>
+        <w:t>Это не просто лекция. Воркшоп сочетает ясное объяснение модели, практические вопросы для самодиагностики, работу с примерами из практики и обсуждение типичных ошибок супервизионного анализа.</w:t>
       </w:r>
     </w:p>
     <w:p>
@@ -381,7 +541,7 @@
           <w:color w:val="232F3E"/>
           <w:sz w:val="22"/>
         </w:rPr>
-        <w:t>практический разбор случая по семи фокусам;</w:t>
+        <w:t>практический разбор клиентского случая по семи фокусам;</w:t>
       </w:r>
     </w:p>
     <w:p>
@@ -514,6 +674,34 @@
           <w:color w:val="27598B"/>
           <w:sz w:val="32"/>
         </w:rPr>
+        <w:t>Главный результат</w:t>
+      </w:r>
+    </w:p>
+    <w:p>
+      <w:pPr>
+        <w:spacing w:after="160"/>
+      </w:pPr>
+      <w:r>
+        <w:rPr>
+          <w:rFonts w:ascii="DejaVu Sans" w:hAnsi="DejaVu Sans"/>
+          <w:b/>
+          <w:color w:val="27598B"/>
+          <w:sz w:val="22"/>
+        </w:rPr>
+        <w:t>После воркшопа у вас будет не набор общих идей, а рабочая супервизионная рамка: как задавать вопросы, куда смотреть в сложном случае, как замечать свои реакции и как сохранять профессиональную ясность в контакте с клиентом.</w:t>
+      </w:r>
+    </w:p>
+    <w:p>
+      <w:pPr>
+        <w:spacing w:before="200" w:after="120"/>
+      </w:pPr>
+      <w:r>
+        <w:rPr>
+          <w:rFonts w:ascii="DejaVu Sans" w:hAnsi="DejaVu Sans"/>
+          <w:b/>
+          <w:color w:val="27598B"/>
+          <w:sz w:val="32"/>
+        </w:rPr>
         <w:t>Продолжительность</w:t>
       </w:r>
     </w:p>
@@ -613,6 +801,20 @@
           <w:sz w:val="22"/>
         </w:rPr>
         <w:t>[Стоимость, условия регистрации, ссылка или контакт]</w:t>
+      </w:r>
+    </w:p>
+    <w:p>
+      <w:pPr>
+        <w:spacing w:after="160"/>
+      </w:pPr>
+      <w:r>
+        <w:rPr>
+          <w:rFonts w:ascii="DejaVu Sans" w:hAnsi="DejaVu Sans"/>
+          <w:b/>
+          <w:color w:val="C69538"/>
+          <w:sz w:val="22"/>
+        </w:rPr>
+        <w:t>Запишитесь на воркшоп, если хотите разбирать клиентские случаи глубже, увереннее и бережнее — с опорой на профессиональную супервизионную модель и христианское понимание человека.</w:t>
       </w:r>
     </w:p>
     <w:p>

</xml_diff>